<commit_message>
Go to whole coastline for timeseries
</commit_message>
<xml_diff>
--- a/tables/envt_coefs_gt.docx
+++ b/tables/envt_coefs_gt.docx
@@ -158,31 +158,31 @@
                 <w:rFonts w:ascii="Calibri" w:hAnsi="Calibri"/>
                 <w:sz w:val="20"/>
               </w:rPr>
-              <w:t xml:space="default">0.021</w:t>
-            </w:r>
-          </w:p>
-        </w:tc>
-        <w:tc>
-          <w:tcPr>
-            <w:tcBorders>
-              <w:top w:val="single" w:space="0" w:color="D3D3D3"/>
-              <w:bottom w:val="single" w:space="0" w:color="D3D3D3"/>
-              <w:start w:val="single" w:space="0" w:color="D3D3D3"/>
-              <w:end w:val="single" w:space="0" w:color="D3D3D3"/>
-            </w:tcBorders>
-          </w:tcPr>
-          <w:p>
-            <w:pPr>
-              <w:spacing w:before="0" w:after="60"/>
-              <w:keepNext/>
-              <w:jc w:val="end"/>
-            </w:pPr>
-            <w:r>
-              <w:rPr>
-                <w:rFonts w:ascii="Calibri" w:hAnsi="Calibri"/>
-                <w:sz w:val="20"/>
-              </w:rPr>
-              <w:t xml:space="default">0.003</w:t>
+              <w:t xml:space="default">0.028</w:t>
+            </w:r>
+          </w:p>
+        </w:tc>
+        <w:tc>
+          <w:tcPr>
+            <w:tcBorders>
+              <w:top w:val="single" w:space="0" w:color="D3D3D3"/>
+              <w:bottom w:val="single" w:space="0" w:color="D3D3D3"/>
+              <w:start w:val="single" w:space="0" w:color="D3D3D3"/>
+              <w:end w:val="single" w:space="0" w:color="D3D3D3"/>
+            </w:tcBorders>
+          </w:tcPr>
+          <w:p>
+            <w:pPr>
+              <w:spacing w:before="0" w:after="60"/>
+              <w:keepNext/>
+              <w:jc w:val="end"/>
+            </w:pPr>
+            <w:r>
+              <w:rPr>
+                <w:rFonts w:ascii="Calibri" w:hAnsi="Calibri"/>
+                <w:sz w:val="20"/>
+              </w:rPr>
+              <w:t xml:space="default">0.002</w:t>
             </w:r>
           </w:p>
         </w:tc>
@@ -259,7 +259,7 @@
                 <w:rFonts w:ascii="Calibri" w:hAnsi="Calibri"/>
                 <w:sz w:val="20"/>
               </w:rPr>
-              <w:t xml:space="default">0.013</w:t>
+              <w:t xml:space="default">0.016</w:t>
             </w:r>
           </w:p>
         </w:tc>
@@ -360,31 +360,31 @@
                 <w:rFonts w:ascii="Calibri" w:hAnsi="Calibri"/>
                 <w:sz w:val="20"/>
               </w:rPr>
-              <w:t xml:space="default">0.045</w:t>
-            </w:r>
-          </w:p>
-        </w:tc>
-        <w:tc>
-          <w:tcPr>
-            <w:tcBorders>
-              <w:top w:val="single" w:space="0" w:color="D3D3D3"/>
-              <w:bottom w:val="single" w:space="0" w:color="D3D3D3"/>
-              <w:start w:val="single" w:space="0" w:color="D3D3D3"/>
-              <w:end w:val="single" w:space="0" w:color="D3D3D3"/>
-            </w:tcBorders>
-          </w:tcPr>
-          <w:p>
-            <w:pPr>
-              <w:spacing w:before="0" w:after="60"/>
-              <w:keepNext/>
-              <w:jc w:val="end"/>
-            </w:pPr>
-            <w:r>
-              <w:rPr>
-                <w:rFonts w:ascii="Calibri" w:hAnsi="Calibri"/>
-                <w:sz w:val="20"/>
-              </w:rPr>
-              <w:t xml:space="default">0.003</w:t>
+              <w:t xml:space="default">0.048</w:t>
+            </w:r>
+          </w:p>
+        </w:tc>
+        <w:tc>
+          <w:tcPr>
+            <w:tcBorders>
+              <w:top w:val="single" w:space="0" w:color="D3D3D3"/>
+              <w:bottom w:val="single" w:space="0" w:color="D3D3D3"/>
+              <w:start w:val="single" w:space="0" w:color="D3D3D3"/>
+              <w:end w:val="single" w:space="0" w:color="D3D3D3"/>
+            </w:tcBorders>
+          </w:tcPr>
+          <w:p>
+            <w:pPr>
+              <w:spacing w:before="0" w:after="60"/>
+              <w:keepNext/>
+              <w:jc w:val="end"/>
+            </w:pPr>
+            <w:r>
+              <w:rPr>
+                <w:rFonts w:ascii="Calibri" w:hAnsi="Calibri"/>
+                <w:sz w:val="20"/>
+              </w:rPr>
+              <w:t xml:space="default">0.001</w:t>
             </w:r>
           </w:p>
         </w:tc>
@@ -461,31 +461,31 @@
                 <w:rFonts w:ascii="Calibri" w:hAnsi="Calibri"/>
                 <w:sz w:val="20"/>
               </w:rPr>
-              <w:t xml:space="default">0.035</w:t>
-            </w:r>
-          </w:p>
-        </w:tc>
-        <w:tc>
-          <w:tcPr>
-            <w:tcBorders>
-              <w:top w:val="single" w:space="0" w:color="D3D3D3"/>
-              <w:bottom w:val="single" w:space="0" w:color="D3D3D3"/>
-              <w:start w:val="single" w:space="0" w:color="D3D3D3"/>
-              <w:end w:val="single" w:space="0" w:color="D3D3D3"/>
-            </w:tcBorders>
-          </w:tcPr>
-          <w:p>
-            <w:pPr>
-              <w:spacing w:before="0" w:after="60"/>
-              <w:keepNext/>
-              <w:jc w:val="end"/>
-            </w:pPr>
-            <w:r>
-              <w:rPr>
-                <w:rFonts w:ascii="Calibri" w:hAnsi="Calibri"/>
-                <w:sz w:val="20"/>
-              </w:rPr>
-              <w:t xml:space="default">0.003</w:t>
+              <w:t xml:space="default">0.026</w:t>
+            </w:r>
+          </w:p>
+        </w:tc>
+        <w:tc>
+          <w:tcPr>
+            <w:tcBorders>
+              <w:top w:val="single" w:space="0" w:color="D3D3D3"/>
+              <w:bottom w:val="single" w:space="0" w:color="D3D3D3"/>
+              <w:start w:val="single" w:space="0" w:color="D3D3D3"/>
+              <w:end w:val="single" w:space="0" w:color="D3D3D3"/>
+            </w:tcBorders>
+          </w:tcPr>
+          <w:p>
+            <w:pPr>
+              <w:spacing w:before="0" w:after="60"/>
+              <w:keepNext/>
+              <w:jc w:val="end"/>
+            </w:pPr>
+            <w:r>
+              <w:rPr>
+                <w:rFonts w:ascii="Calibri" w:hAnsi="Calibri"/>
+                <w:sz w:val="20"/>
+              </w:rPr>
+              <w:t xml:space="default">0.002</w:t>
             </w:r>
           </w:p>
         </w:tc>
@@ -562,7 +562,7 @@
                 <w:rFonts w:ascii="Calibri" w:hAnsi="Calibri"/>
                 <w:sz w:val="20"/>
               </w:rPr>
-              <w:t xml:space="default">0.002</w:t>
+              <w:t xml:space="default">0.001</w:t>
             </w:r>
           </w:p>
         </w:tc>
@@ -764,31 +764,7 @@
                 <w:rFonts w:ascii="Calibri" w:hAnsi="Calibri"/>
                 <w:sz w:val="20"/>
               </w:rPr>
-              <w:t xml:space="default">-0.043</w:t>
-            </w:r>
-          </w:p>
-        </w:tc>
-        <w:tc>
-          <w:tcPr>
-            <w:tcBorders>
-              <w:top w:val="single" w:space="0" w:color="D3D3D3"/>
-              <w:bottom w:val="single" w:space="0" w:color="D3D3D3"/>
-              <w:start w:val="single" w:space="0" w:color="D3D3D3"/>
-              <w:end w:val="single" w:space="0" w:color="D3D3D3"/>
-            </w:tcBorders>
-          </w:tcPr>
-          <w:p>
-            <w:pPr>
-              <w:spacing w:before="0" w:after="60"/>
-              <w:keepNext/>
-              <w:jc w:val="end"/>
-            </w:pPr>
-            <w:r>
-              <w:rPr>
-                <w:rFonts w:ascii="Calibri" w:hAnsi="Calibri"/>
-                <w:sz w:val="20"/>
-              </w:rPr>
-              <w:t xml:space="default">0.015</w:t>
+              <w:t xml:space="default">-0.027</w:t>
             </w:r>
           </w:p>
         </w:tc>
@@ -813,6 +789,30 @@
                 <w:sz w:val="20"/>
               </w:rPr>
               <w:t xml:space="default">0.004</w:t>
+            </w:r>
+          </w:p>
+        </w:tc>
+        <w:tc>
+          <w:tcPr>
+            <w:tcBorders>
+              <w:top w:val="single" w:space="0" w:color="D3D3D3"/>
+              <w:bottom w:val="single" w:space="0" w:color="D3D3D3"/>
+              <w:start w:val="single" w:space="0" w:color="D3D3D3"/>
+              <w:end w:val="single" w:space="0" w:color="D3D3D3"/>
+            </w:tcBorders>
+          </w:tcPr>
+          <w:p>
+            <w:pPr>
+              <w:spacing w:before="0" w:after="60"/>
+              <w:keepNext/>
+              <w:jc w:val="end"/>
+            </w:pPr>
+            <w:r>
+              <w:rPr>
+                <w:rFonts w:ascii="Calibri" w:hAnsi="Calibri"/>
+                <w:sz w:val="20"/>
+              </w:rPr>
+              <w:t xml:space="default">0.000</w:t>
             </w:r>
           </w:p>
         </w:tc>
@@ -865,55 +865,55 @@
                 <w:rFonts w:ascii="Calibri" w:hAnsi="Calibri"/>
                 <w:sz w:val="20"/>
               </w:rPr>
-              <w:t xml:space="default">-0.079</w:t>
-            </w:r>
-          </w:p>
-        </w:tc>
-        <w:tc>
-          <w:tcPr>
-            <w:tcBorders>
-              <w:top w:val="single" w:space="0" w:color="D3D3D3"/>
-              <w:bottom w:val="single" w:space="0" w:color="D3D3D3"/>
-              <w:start w:val="single" w:space="0" w:color="D3D3D3"/>
-              <w:end w:val="single" w:space="0" w:color="D3D3D3"/>
-            </w:tcBorders>
-          </w:tcPr>
-          <w:p>
-            <w:pPr>
-              <w:spacing w:before="0" w:after="60"/>
-              <w:keepNext/>
-              <w:jc w:val="end"/>
-            </w:pPr>
-            <w:r>
-              <w:rPr>
-                <w:rFonts w:ascii="Calibri" w:hAnsi="Calibri"/>
-                <w:sz w:val="20"/>
-              </w:rPr>
-              <w:t xml:space="default">0.029</w:t>
-            </w:r>
-          </w:p>
-        </w:tc>
-        <w:tc>
-          <w:tcPr>
-            <w:tcBorders>
-              <w:top w:val="single" w:space="0" w:color="D3D3D3"/>
-              <w:bottom w:val="single" w:space="0" w:color="D3D3D3"/>
-              <w:start w:val="single" w:space="0" w:color="D3D3D3"/>
-              <w:end w:val="single" w:space="0" w:color="D3D3D3"/>
-            </w:tcBorders>
-          </w:tcPr>
-          <w:p>
-            <w:pPr>
-              <w:spacing w:before="0" w:after="60"/>
-              <w:keepNext/>
-              <w:jc w:val="end"/>
-            </w:pPr>
-            <w:r>
-              <w:rPr>
-                <w:rFonts w:ascii="Calibri" w:hAnsi="Calibri"/>
-                <w:sz w:val="20"/>
-              </w:rPr>
-              <w:t xml:space="default">0.006</w:t>
+              <w:t xml:space="default">-0.066</w:t>
+            </w:r>
+          </w:p>
+        </w:tc>
+        <w:tc>
+          <w:tcPr>
+            <w:tcBorders>
+              <w:top w:val="single" w:space="0" w:color="D3D3D3"/>
+              <w:bottom w:val="single" w:space="0" w:color="D3D3D3"/>
+              <w:start w:val="single" w:space="0" w:color="D3D3D3"/>
+              <w:end w:val="single" w:space="0" w:color="D3D3D3"/>
+            </w:tcBorders>
+          </w:tcPr>
+          <w:p>
+            <w:pPr>
+              <w:spacing w:before="0" w:after="60"/>
+              <w:keepNext/>
+              <w:jc w:val="end"/>
+            </w:pPr>
+            <w:r>
+              <w:rPr>
+                <w:rFonts w:ascii="Calibri" w:hAnsi="Calibri"/>
+                <w:sz w:val="20"/>
+              </w:rPr>
+              <w:t xml:space="default">0.002</w:t>
+            </w:r>
+          </w:p>
+        </w:tc>
+        <w:tc>
+          <w:tcPr>
+            <w:tcBorders>
+              <w:top w:val="single" w:space="0" w:color="D3D3D3"/>
+              <w:bottom w:val="single" w:space="0" w:color="D3D3D3"/>
+              <w:start w:val="single" w:space="0" w:color="D3D3D3"/>
+              <w:end w:val="single" w:space="0" w:color="D3D3D3"/>
+            </w:tcBorders>
+          </w:tcPr>
+          <w:p>
+            <w:pPr>
+              <w:spacing w:before="0" w:after="60"/>
+              <w:keepNext/>
+              <w:jc w:val="end"/>
+            </w:pPr>
+            <w:r>
+              <w:rPr>
+                <w:rFonts w:ascii="Calibri" w:hAnsi="Calibri"/>
+                <w:sz w:val="20"/>
+              </w:rPr>
+              <w:t xml:space="default">0.000</w:t>
             </w:r>
           </w:p>
         </w:tc>
@@ -966,31 +966,31 @@
                 <w:rFonts w:ascii="Calibri" w:hAnsi="Calibri"/>
                 <w:sz w:val="20"/>
               </w:rPr>
-              <w:t xml:space="default">-0.006</w:t>
-            </w:r>
-          </w:p>
-        </w:tc>
-        <w:tc>
-          <w:tcPr>
-            <w:tcBorders>
-              <w:top w:val="single" w:space="0" w:color="D3D3D3"/>
-              <w:bottom w:val="single" w:space="0" w:color="D3D3D3"/>
-              <w:start w:val="single" w:space="0" w:color="D3D3D3"/>
-              <w:end w:val="single" w:space="0" w:color="D3D3D3"/>
-            </w:tcBorders>
-          </w:tcPr>
-          <w:p>
-            <w:pPr>
-              <w:spacing w:before="0" w:after="60"/>
-              <w:keepNext/>
-              <w:jc w:val="end"/>
-            </w:pPr>
-            <w:r>
-              <w:rPr>
-                <w:rFonts w:ascii="Calibri" w:hAnsi="Calibri"/>
-                <w:sz w:val="20"/>
-              </w:rPr>
-              <w:t xml:space="default">0.001</w:t>
+              <w:t xml:space="default">-0.004</w:t>
+            </w:r>
+          </w:p>
+        </w:tc>
+        <w:tc>
+          <w:tcPr>
+            <w:tcBorders>
+              <w:top w:val="single" w:space="0" w:color="D3D3D3"/>
+              <w:bottom w:val="single" w:space="0" w:color="D3D3D3"/>
+              <w:start w:val="single" w:space="0" w:color="D3D3D3"/>
+              <w:end w:val="single" w:space="0" w:color="D3D3D3"/>
+            </w:tcBorders>
+          </w:tcPr>
+          <w:p>
+            <w:pPr>
+              <w:spacing w:before="0" w:after="60"/>
+              <w:keepNext/>
+              <w:jc w:val="end"/>
+            </w:pPr>
+            <w:r>
+              <w:rPr>
+                <w:rFonts w:ascii="Calibri" w:hAnsi="Calibri"/>
+                <w:sz w:val="20"/>
+              </w:rPr>
+              <w:t xml:space="default">0.000</w:t>
             </w:r>
           </w:p>
         </w:tc>

</xml_diff>

<commit_message>
Cleanup environmental time series
</commit_message>
<xml_diff>
--- a/tables/envt_coefs_gt.docx
+++ b/tables/envt_coefs_gt.docx
@@ -158,31 +158,31 @@
                 <w:rFonts w:ascii="Calibri" w:hAnsi="Calibri"/>
                 <w:sz w:val="20"/>
               </w:rPr>
-              <w:t xml:space="default">0.028</w:t>
-            </w:r>
-          </w:p>
-        </w:tc>
-        <w:tc>
-          <w:tcPr>
-            <w:tcBorders>
-              <w:top w:val="single" w:space="0" w:color="D3D3D3"/>
-              <w:bottom w:val="single" w:space="0" w:color="D3D3D3"/>
-              <w:start w:val="single" w:space="0" w:color="D3D3D3"/>
-              <w:end w:val="single" w:space="0" w:color="D3D3D3"/>
-            </w:tcBorders>
-          </w:tcPr>
-          <w:p>
-            <w:pPr>
-              <w:spacing w:before="0" w:after="60"/>
-              <w:keepNext/>
-              <w:jc w:val="end"/>
-            </w:pPr>
-            <w:r>
-              <w:rPr>
-                <w:rFonts w:ascii="Calibri" w:hAnsi="Calibri"/>
-                <w:sz w:val="20"/>
-              </w:rPr>
-              <w:t xml:space="default">0.002</w:t>
+              <w:t xml:space="default">0.025</w:t>
+            </w:r>
+          </w:p>
+        </w:tc>
+        <w:tc>
+          <w:tcPr>
+            <w:tcBorders>
+              <w:top w:val="single" w:space="0" w:color="D3D3D3"/>
+              <w:bottom w:val="single" w:space="0" w:color="D3D3D3"/>
+              <w:start w:val="single" w:space="0" w:color="D3D3D3"/>
+              <w:end w:val="single" w:space="0" w:color="D3D3D3"/>
+            </w:tcBorders>
+          </w:tcPr>
+          <w:p>
+            <w:pPr>
+              <w:spacing w:before="0" w:after="60"/>
+              <w:keepNext/>
+              <w:jc w:val="end"/>
+            </w:pPr>
+            <w:r>
+              <w:rPr>
+                <w:rFonts w:ascii="Calibri" w:hAnsi="Calibri"/>
+                <w:sz w:val="20"/>
+              </w:rPr>
+              <w:t xml:space="default">0.011</w:t>
             </w:r>
           </w:p>
         </w:tc>
@@ -259,31 +259,31 @@
                 <w:rFonts w:ascii="Calibri" w:hAnsi="Calibri"/>
                 <w:sz w:val="20"/>
               </w:rPr>
-              <w:t xml:space="default">0.016</w:t>
-            </w:r>
-          </w:p>
-        </w:tc>
-        <w:tc>
-          <w:tcPr>
-            <w:tcBorders>
-              <w:top w:val="single" w:space="0" w:color="D3D3D3"/>
-              <w:bottom w:val="single" w:space="0" w:color="D3D3D3"/>
-              <w:start w:val="single" w:space="0" w:color="D3D3D3"/>
-              <w:end w:val="single" w:space="0" w:color="D3D3D3"/>
-            </w:tcBorders>
-          </w:tcPr>
-          <w:p>
-            <w:pPr>
-              <w:spacing w:before="0" w:after="60"/>
-              <w:keepNext/>
-              <w:jc w:val="end"/>
-            </w:pPr>
-            <w:r>
-              <w:rPr>
-                <w:rFonts w:ascii="Calibri" w:hAnsi="Calibri"/>
-                <w:sz w:val="20"/>
-              </w:rPr>
-              <w:t xml:space="default">0.001</w:t>
+              <w:t xml:space="default">0.013</w:t>
+            </w:r>
+          </w:p>
+        </w:tc>
+        <w:tc>
+          <w:tcPr>
+            <w:tcBorders>
+              <w:top w:val="single" w:space="0" w:color="D3D3D3"/>
+              <w:bottom w:val="single" w:space="0" w:color="D3D3D3"/>
+              <w:start w:val="single" w:space="0" w:color="D3D3D3"/>
+              <w:end w:val="single" w:space="0" w:color="D3D3D3"/>
+            </w:tcBorders>
+          </w:tcPr>
+          <w:p>
+            <w:pPr>
+              <w:spacing w:before="0" w:after="60"/>
+              <w:keepNext/>
+              <w:jc w:val="end"/>
+            </w:pPr>
+            <w:r>
+              <w:rPr>
+                <w:rFonts w:ascii="Calibri" w:hAnsi="Calibri"/>
+                <w:sz w:val="20"/>
+              </w:rPr>
+              <w:t xml:space="default">0.005</w:t>
             </w:r>
           </w:p>
         </w:tc>
@@ -384,7 +384,7 @@
                 <w:rFonts w:ascii="Calibri" w:hAnsi="Calibri"/>
                 <w:sz w:val="20"/>
               </w:rPr>
-              <w:t xml:space="default">0.001</w:t>
+              <w:t xml:space="default">0.020</w:t>
             </w:r>
           </w:p>
         </w:tc>
@@ -485,7 +485,7 @@
                 <w:rFonts w:ascii="Calibri" w:hAnsi="Calibri"/>
                 <w:sz w:val="20"/>
               </w:rPr>
-              <w:t xml:space="default">0.002</w:t>
+              <w:t xml:space="default">0.033</w:t>
             </w:r>
           </w:p>
         </w:tc>
@@ -586,7 +586,7 @@
                 <w:rFonts w:ascii="Calibri" w:hAnsi="Calibri"/>
                 <w:sz w:val="20"/>
               </w:rPr>
-              <w:t xml:space="default">0.000</w:t>
+              <w:t xml:space="default">0.001</w:t>
             </w:r>
           </w:p>
         </w:tc>
@@ -788,7 +788,7 @@
                 <w:rFonts w:ascii="Calibri" w:hAnsi="Calibri"/>
                 <w:sz w:val="20"/>
               </w:rPr>
-              <w:t xml:space="default">0.004</w:t>
+              <w:t xml:space="default">0.085</w:t>
             </w:r>
           </w:p>
         </w:tc>

</xml_diff>